<commit_message>
Finalize the SQL files and update
</commit_message>
<xml_diff>
--- a/SmartIntern_Project_Report.docx
+++ b/SmartIntern_Project_Report.docx
@@ -1864,16 +1864,8 @@
             </w:tcMar>
           </w:tcPr>
           <w:p>
-            <w:pPr>
-              <w:spacing w:after="0"/>
-            </w:pPr>
-            <w:r/>
             <w:r>
-              <w:rPr>
-                <w:b w:val="0"/>
-                <w:sz w:val="14"/>
-              </w:rPr>
-              <w:t>Each Internship must have at least one Internship_Skill record before it can be considered complete for matching.</w:t>
+              <w:t>Each Internship must have at least one Internship_Skill record before students can apply. Applications are rejected until a requirement is added.</w:t>
             </w:r>
           </w:p>
         </w:tc>
@@ -2335,16 +2327,8 @@
             </w:tcMar>
           </w:tcPr>
           <w:p>
-            <w:pPr>
-              <w:spacing w:after="0"/>
-            </w:pPr>
-            <w:r/>
             <w:r>
-              <w:rPr>
-                <w:b w:val="0"/>
-                <w:sz w:val="14"/>
-              </w:rPr>
-              <w:t>User is the supertype. Student and Company are subtypes. The relationship is implemented by storing user_id as a unique foreign key in each subtype table. The specialization is disjoint because one account has only one role, and partial because only Student and Company roles are supported in this project.</w:t>
+              <w:t>User is the supertype. Student and Company are subtypes. The relationship is implemented using separate profile primary keys and unique user_id foreign keys. The specialization is disjoint and partial in the database: a profile can belong to only one matching role, while a User row may have no subtype profile. Supported role values are Student and Company; Admin and career-support accounts/workflows are out of scope. Seeded demo accounts each have a matching profile.</w:t>
             </w:r>
           </w:p>
         </w:tc>
@@ -2415,16 +2399,8 @@
             <w:shd w:fill="F5F5F5"/>
           </w:tcPr>
           <w:p>
-            <w:pPr>
-              <w:spacing w:after="0"/>
-            </w:pPr>
-            <w:r/>
             <w:r>
-              <w:rPr>
-                <w:b w:val="0"/>
-                <w:sz w:val="14"/>
-              </w:rPr>
-              <w:t>A student may have multiple education records, but one record is designated current with is_current = TRUE.</w:t>
+              <w:t>A student may have multiple education records, but at most one is current (is_current = TRUE). A unique functional index enforces this rule, and the application updates the current record transactionally.</w:t>
             </w:r>
           </w:p>
         </w:tc>
@@ -3030,7 +3006,7 @@
     </w:p>
     <w:p>
       <w:r>
-        <w:t>The EER design treats User as the supertype and Student and Company as subtypes. The implementation uses separate primary keys for the subtype tables and a unique user_id foreign key in each subtype table. The design includes bridge tables for every agreed many-to-many relationship. Student-specific attributes remain on the bridge records where they describe the relationship rather than the shared catalog record.</w:t>
+        <w:t>The EER design treats User as the supertype and Student and Company as subtypes. The specialization is disjoint and partial in the relational schema: profile triggers reject role mismatches, and unique user_id foreign keys prevent one User from having multiple profiles of the same subtype. The schema permits a User row without a Student or Company profile; each seeded demo account has its matching profile. Admin and career-support workflows are out of scope. The design includes bridge tables for every agreed many-to-many relationship. Student-specific attributes remain on bridge records where they describe the relationship rather than a shared catalog record.</w:t>
       </w:r>
     </w:p>
     <w:p>
@@ -8601,18 +8577,13 @@
         <w:ind w:left="288" w:right="288"/>
       </w:pPr>
       <w:r>
-        <w:rPr>
-          <w:rFonts w:ascii="Consolas" w:hAnsi="Consolas"/>
-          <w:color w:val="232323"/>
-          <w:sz w:val="14"/>
-        </w:rPr>
-        <w:t>Skill points = (satisfied skills / total required skills) * 60</w:t>
-        <w:br/>
-        <w:t>GPA points = (GPA / 4.00) * 20 when GPA &gt;= minimum GPA</w:t>
-        <w:br/>
-        <w:t>Study-year points = (study year / 4.00) * 20 when study year &gt;= minimum study year</w:t>
-        <w:br/>
-        <w:t>Match score = skill points + GPA points + study-year points</w:t>
+        <w:t>Skill points = (satisfied skills / total required skills) * 60; this component is zero if any mandatory skill fails. Internships without skill requirements are excluded from matching and cannot receive applications.</w:t>
+        <w:br/>
+        <w:t>GPA points = (GPA / 4.00) * 20 when GPA &gt;= minimum GPA; otherwise zero.</w:t>
+        <w:br/>
+        <w:t>Study-year points = (MIN(study year, 4) / 4.00) * 20 when study year &gt;= minimum study year; otherwise zero.</w:t>
+        <w:br/>
+        <w:t>Match score = skill points + GPA points + study-year points.</w:t>
       </w:r>
     </w:p>
     <w:p>
@@ -8639,11 +8610,12 @@
         <w:ind w:left="288" w:right="288"/>
       </w:pPr>
       <w:r>
-        <w:rPr>
-          <w:rFonts w:ascii="Consolas" w:hAnsi="Consolas"/>
-          <w:color w:val="232323"/>
-          <w:sz w:val="14"/>
-        </w:rPr>
+        <w:t>-- Final schema for MySQL 8.0.13+ (functional index enforces one current education row per student).</w:t>
+        <w:br/>
+        <w:t>-- Role/profile triggers enforce the disjoint subtype mapping; the application</w:t>
+        <w:br/>
+        <w:t>-- must create the matching profile as part of account creation.</w:t>
+        <w:br/>
         <w:t>CREATE DATABASE IF NOT EXISTS smartintern_db;</w:t>
         <w:br/>
         <w:t>USE smartintern_db;</w:t>
@@ -8884,6 +8856,8 @@
         <w:br/>
         <w:t xml:space="preserve">    PRIMARY KEY (student_id, education_id),</w:t>
         <w:br/>
+        <w:t xml:space="preserve">    UNIQUE KEY uq_student_one_current_education ((CASE WHEN is_current = TRUE THEN student_id ELSE NULL END)),</w:t>
+        <w:br/>
         <w:t xml:space="preserve">    CONSTRAINT chk_student_education_gpa</w:t>
         <w:br/>
         <w:t xml:space="preserve">        CHECK (gpa BETWEEN 0.00 AND 4.00),</w:t>
@@ -9019,12 +8993,134 @@
         <w:t xml:space="preserve">        ON DELETE RESTRICT ON UPDATE CASCADE</w:t>
         <w:br/>
         <w:t>);</w:t>
+        <w:br/>
+        <w:br/>
+        <w:t>-- Enforce the disjoint User subtype mapping. Total participation is completed</w:t>
+        <w:br/>
+        <w:t>-- by the app creating the matching profile in the same account workflow.</w:t>
+        <w:br/>
+        <w:t>DELIMITER $$</w:t>
+        <w:br/>
+        <w:t>CREATE TRIGGER trg_applications_require_skill</w:t>
+        <w:br/>
+        <w:t>BEFORE INSERT ON applications</w:t>
+        <w:br/>
+        <w:t>FOR EACH ROW</w:t>
+        <w:br/>
+        <w:t>BEGIN</w:t>
+        <w:br/>
+        <w:t xml:space="preserve">    IF NOT EXISTS (</w:t>
+        <w:br/>
+        <w:t xml:space="preserve">        SELECT 1 FROM internship_skills</w:t>
+        <w:br/>
+        <w:t xml:space="preserve">        WHERE internship_id = NEW.internship_id</w:t>
+        <w:br/>
+        <w:t xml:space="preserve">    ) THEN</w:t>
+        <w:br/>
+        <w:t xml:space="preserve">        SIGNAL SQLSTATE '45000'</w:t>
+        <w:br/>
+        <w:t xml:space="preserve">            SET MESSAGE_TEXT = 'Internship requires at least one skill before applications';</w:t>
+        <w:br/>
+        <w:t xml:space="preserve">    END IF;</w:t>
+        <w:br/>
+        <w:t>END$$</w:t>
+        <w:br/>
+        <w:t>CREATE TRIGGER trg_users_role_update</w:t>
+        <w:br/>
+        <w:t>BEFORE UPDATE ON users</w:t>
+        <w:br/>
+        <w:t>FOR EACH ROW</w:t>
+        <w:br/>
+        <w:t>BEGIN</w:t>
+        <w:br/>
+        <w:t xml:space="preserve">    IF NEW.role &lt;&gt; OLD.role</w:t>
+        <w:br/>
+        <w:t xml:space="preserve">       AND (EXISTS (SELECT 1 FROM students WHERE user_id = OLD.user_id)</w:t>
+        <w:br/>
+        <w:t xml:space="preserve">            OR EXISTS (SELECT 1 FROM companies WHERE user_id = OLD.user_id)) THEN</w:t>
+        <w:br/>
+        <w:t xml:space="preserve">        SIGNAL SQLSTATE '45000'</w:t>
+        <w:br/>
+        <w:t xml:space="preserve">            SET MESSAGE_TEXT = 'Account role cannot change while a profile exists';</w:t>
+        <w:br/>
+        <w:t xml:space="preserve">    END IF;</w:t>
+        <w:br/>
+        <w:t>END$$</w:t>
+        <w:br/>
+        <w:t>CREATE TRIGGER trg_students_role_insert</w:t>
+        <w:br/>
+        <w:t>BEFORE INSERT ON students</w:t>
+        <w:br/>
+        <w:t>FOR EACH ROW</w:t>
+        <w:br/>
+        <w:t>BEGIN</w:t>
+        <w:br/>
+        <w:t xml:space="preserve">    IF NOT EXISTS (SELECT 1 FROM users WHERE user_id = NEW.user_id AND role = 'Student') THEN</w:t>
+        <w:br/>
+        <w:t xml:space="preserve">        SIGNAL SQLSTATE '45000' SET MESSAGE_TEXT = 'Student profile requires a Student user account';</w:t>
+        <w:br/>
+        <w:t xml:space="preserve">    END IF;</w:t>
+        <w:br/>
+        <w:t>END$$</w:t>
+        <w:br/>
+        <w:t>CREATE TRIGGER trg_students_role_update</w:t>
+        <w:br/>
+        <w:t>BEFORE UPDATE ON students</w:t>
+        <w:br/>
+        <w:t>FOR EACH ROW</w:t>
+        <w:br/>
+        <w:t>BEGIN</w:t>
+        <w:br/>
+        <w:t xml:space="preserve">    IF NOT EXISTS (SELECT 1 FROM users WHERE user_id = NEW.user_id AND role = 'Student') THEN</w:t>
+        <w:br/>
+        <w:t xml:space="preserve">        SIGNAL SQLSTATE '45000' SET MESSAGE_TEXT = 'Student profile requires a Student user account';</w:t>
+        <w:br/>
+        <w:t xml:space="preserve">    END IF;</w:t>
+        <w:br/>
+        <w:t>END$$</w:t>
+        <w:br/>
+        <w:t>CREATE TRIGGER trg_companies_role_insert</w:t>
+        <w:br/>
+        <w:t>BEFORE INSERT ON companies</w:t>
+        <w:br/>
+        <w:t>FOR EACH ROW</w:t>
+        <w:br/>
+        <w:t>BEGIN</w:t>
+        <w:br/>
+        <w:t xml:space="preserve">    IF NOT EXISTS (SELECT 1 FROM users WHERE user_id = NEW.user_id AND role = 'Company') THEN</w:t>
+        <w:br/>
+        <w:t xml:space="preserve">        SIGNAL SQLSTATE '45000' SET MESSAGE_TEXT = 'Company profile requires a Company user account';</w:t>
+        <w:br/>
+        <w:t xml:space="preserve">    END IF;</w:t>
+        <w:br/>
+        <w:t>END$$</w:t>
+        <w:br/>
+        <w:t>CREATE TRIGGER trg_companies_role_update</w:t>
+        <w:br/>
+        <w:t>BEFORE UPDATE ON companies</w:t>
+        <w:br/>
+        <w:t>FOR EACH ROW</w:t>
+        <w:br/>
+        <w:t>BEGIN</w:t>
+        <w:br/>
+        <w:t xml:space="preserve">    IF NOT EXISTS (SELECT 1 FROM users WHERE user_id = NEW.user_id AND role = 'Company') THEN</w:t>
+        <w:br/>
+        <w:t xml:space="preserve">        SIGNAL SQLSTATE '45000' SET MESSAGE_TEXT = 'Company profile requires a Company user account';</w:t>
+        <w:br/>
+        <w:t xml:space="preserve">    END IF;</w:t>
+        <w:br/>
+        <w:t>END$$</w:t>
+        <w:br/>
+        <w:t>DELIMITER ;</w:t>
+        <w:br/>
+        <w:br/>
         <w:br/>
       </w:r>
     </w:p>
     <w:p>
+      <w:pPr/>
       <w:r>
-        <w:t>The complete DDL file should be submitted with the report as part of the project source. The excerpt above shows the implemented schema structure; the full file remains the executable source of truth.</w:t>
+        <w:t>The complete schema file includes primary and foreign keys, uniqueness and range constraints, current-education enforcement, role/profile consistency triggers, and a trigger that rejects applications until the internship has at least one skill requirement.</w:t>
       </w:r>
     </w:p>
     <w:p>
@@ -9046,11 +9142,10 @@
         <w:ind w:left="288" w:right="288"/>
       </w:pPr>
       <w:r>
-        <w:rPr>
-          <w:rFonts w:ascii="Consolas" w:hAnsi="Consolas"/>
-          <w:color w:val="232323"/>
-          <w:sz w:val="14"/>
-        </w:rPr>
+        <w:t>-- Demo rows match each account role to one profile and provide one current</w:t>
+        <w:br/>
+        <w:t>-- education record for each student with education data.</w:t>
+        <w:br/>
         <w:t>USE smartintern_db;</w:t>
         <w:br/>
         <w:br/>
@@ -9258,12 +9353,14 @@
         <w:t>(4, 1, 2, '2026-09-23', 'Accepted', 93.00),</w:t>
         <w:br/>
         <w:t>(5, 3, 3, '2026-09-24', 'Under Review', 70.00);</w:t>
+        <w:br/>
         <w:br/>
       </w:r>
     </w:p>
     <w:p>
+      <w:pPr/>
       <w:r>
-        <w:t>The optional database/migrations/08_seed_demo_opportunities.sql file adds additional local internship opportunities for application demonstration. It should be run only after the base schema and sample data when the larger demonstration dataset is required.</w:t>
+        <w:t>The optional database/04_seed_demo_opportunities.sql file adds 8 companies and 17 internships after the base schema and sample data, bringing the demo catalog to 10 companies and 20 internships. It can be rerun safely.</w:t>
       </w:r>
     </w:p>
     <w:p>
@@ -10559,15 +10656,7 @@
             </w:tcMar>
           </w:tcPr>
           <w:p>
-            <w:pPr>
-              <w:spacing w:after="0"/>
-            </w:pPr>
-            <w:r/>
             <w:r>
-              <w:rPr>
-                <w:b w:val="0"/>
-                <w:sz w:val="17"/>
-              </w:rPr>
               <w:t>database/01_create_schema.sql</w:t>
             </w:r>
           </w:p>
@@ -10584,16 +10673,8 @@
             </w:tcMar>
           </w:tcPr>
           <w:p>
-            <w:pPr>
-              <w:spacing w:after="0"/>
-            </w:pPr>
-            <w:r/>
             <w:r>
-              <w:rPr>
-                <w:b w:val="0"/>
-                <w:sz w:val="17"/>
-              </w:rPr>
-              <w:t>Fresh database creation and DDL.</w:t>
+              <w:t>Fresh database creation, relational schema, and integrity triggers.</w:t>
             </w:r>
           </w:p>
         </w:tc>
@@ -10612,15 +10693,7 @@
             <w:shd w:fill="F5F5F5"/>
           </w:tcPr>
           <w:p>
-            <w:pPr>
-              <w:spacing w:after="0"/>
-            </w:pPr>
-            <w:r/>
             <w:r>
-              <w:rPr>
-                <w:b w:val="0"/>
-                <w:sz w:val="17"/>
-              </w:rPr>
               <w:t>database/02_sample_data.sql</w:t>
             </w:r>
           </w:p>
@@ -10638,16 +10711,8 @@
             <w:shd w:fill="F5F5F5"/>
           </w:tcPr>
           <w:p>
-            <w:pPr>
-              <w:spacing w:after="0"/>
-            </w:pPr>
-            <w:r/>
             <w:r>
-              <w:rPr>
-                <w:b w:val="0"/>
-                <w:sz w:val="17"/>
-              </w:rPr>
-              <w:t>Fabricated DML records for demonstration.</w:t>
+              <w:t>Fabricated sample records for demonstration.</w:t>
             </w:r>
           </w:p>
         </w:tc>
@@ -10665,16 +10730,8 @@
             </w:tcMar>
           </w:tcPr>
           <w:p>
-            <w:pPr>
-              <w:spacing w:after="0"/>
-            </w:pPr>
-            <w:r/>
             <w:r>
-              <w:rPr>
-                <w:b w:val="0"/>
-                <w:sz w:val="17"/>
-              </w:rPr>
-              <w:t>database/03_business_queries.sql</w:t>
+              <w:t>database/04_seed_demo_opportunities.sql</w:t>
             </w:r>
           </w:p>
         </w:tc>
@@ -10690,16 +10747,8 @@
             </w:tcMar>
           </w:tcPr>
           <w:p>
-            <w:pPr>
-              <w:spacing w:after="0"/>
-            </w:pPr>
-            <w:r/>
             <w:r>
-              <w:rPr>
-                <w:b w:val="0"/>
-                <w:sz w:val="17"/>
-              </w:rPr>
-              <w:t>Business questions and matching reports.</w:t>
+              <w:t>Optional seed for the larger demo catalog.</w:t>
             </w:r>
           </w:p>
         </w:tc>
@@ -10707,265 +10756,21 @@
       <w:tr>
         <w:tc>
           <w:tcPr>
-            <w:tcW w:type="dxa" w:w="4464"/>
-            <w:vAlign w:val="center"/>
-            <w:tcMar>
-              <w:top w:w="90" w:type="dxa"/>
-              <w:start w:w="110" w:type="dxa"/>
-              <w:bottom w:w="90" w:type="dxa"/>
-              <w:end w:w="110" w:type="dxa"/>
-            </w:tcMar>
-            <w:shd w:fill="F5F5F5"/>
+            <w:tcW w:type="dxa" w:w="5040"/>
           </w:tcPr>
           <w:p>
-            <w:pPr>
-              <w:spacing w:after="0"/>
-            </w:pPr>
-            <w:r/>
             <w:r>
-              <w:rPr>
-                <w:b w:val="0"/>
-                <w:sz w:val="17"/>
-              </w:rPr>
-              <w:t>database/migrations/04_update_demo_passwords.sql</w:t>
+              <w:t>database/03_business_queries.sql</w:t>
             </w:r>
           </w:p>
         </w:tc>
         <w:tc>
           <w:tcPr>
-            <w:tcW w:type="dxa" w:w="5328"/>
-            <w:vAlign w:val="center"/>
-            <w:tcMar>
-              <w:top w:w="90" w:type="dxa"/>
-              <w:start w:w="110" w:type="dxa"/>
-              <w:bottom w:w="90" w:type="dxa"/>
-              <w:end w:w="110" w:type="dxa"/>
-            </w:tcMar>
-            <w:shd w:fill="F5F5F5"/>
+            <w:tcW w:type="dxa" w:w="5040"/>
           </w:tcPr>
           <w:p>
-            <w:pPr>
-              <w:spacing w:after="0"/>
-            </w:pPr>
-            <w:r/>
             <w:r>
-              <w:rPr>
-                <w:b w:val="0"/>
-                <w:sz w:val="17"/>
-              </w:rPr>
-              <w:t>Optional migration for older demo accounts.</w:t>
-            </w:r>
-          </w:p>
-        </w:tc>
-      </w:tr>
-      <w:tr>
-        <w:tc>
-          <w:tcPr>
-            <w:tcW w:type="dxa" w:w="4464"/>
-            <w:vAlign w:val="center"/>
-            <w:tcMar>
-              <w:top w:w="90" w:type="dxa"/>
-              <w:start w:w="110" w:type="dxa"/>
-              <w:bottom w:w="90" w:type="dxa"/>
-              <w:end w:w="110" w:type="dxa"/>
-            </w:tcMar>
-          </w:tcPr>
-          <w:p>
-            <w:pPr>
-              <w:spacing w:after="0"/>
-            </w:pPr>
-            <w:r/>
-            <w:r>
-              <w:rPr>
-                <w:b w:val="0"/>
-                <w:sz w:val="17"/>
-              </w:rPr>
-              <w:t>database/migrations/05_update_experience_structure.sql</w:t>
-            </w:r>
-          </w:p>
-        </w:tc>
-        <w:tc>
-          <w:tcPr>
-            <w:tcW w:type="dxa" w:w="5328"/>
-            <w:vAlign w:val="center"/>
-            <w:tcMar>
-              <w:top w:w="90" w:type="dxa"/>
-              <w:start w:w="110" w:type="dxa"/>
-              <w:bottom w:w="90" w:type="dxa"/>
-              <w:end w:w="110" w:type="dxa"/>
-            </w:tcMar>
-          </w:tcPr>
-          <w:p>
-            <w:pPr>
-              <w:spacing w:after="0"/>
-            </w:pPr>
-            <w:r/>
-            <w:r>
-              <w:rPr>
-                <w:b w:val="0"/>
-                <w:sz w:val="17"/>
-              </w:rPr>
-              <w:t>Optional migration for older experience structure.</w:t>
-            </w:r>
-          </w:p>
-        </w:tc>
-      </w:tr>
-      <w:tr>
-        <w:tc>
-          <w:tcPr>
-            <w:tcW w:type="dxa" w:w="4464"/>
-            <w:vAlign w:val="center"/>
-            <w:tcMar>
-              <w:top w:w="90" w:type="dxa"/>
-              <w:start w:w="110" w:type="dxa"/>
-              <w:bottom w:w="90" w:type="dxa"/>
-              <w:end w:w="110" w:type="dxa"/>
-            </w:tcMar>
-            <w:shd w:fill="F5F5F5"/>
-          </w:tcPr>
-          <w:p>
-            <w:pPr>
-              <w:spacing w:after="0"/>
-            </w:pPr>
-            <w:r/>
-            <w:r>
-              <w:rPr>
-                <w:b w:val="0"/>
-                <w:sz w:val="17"/>
-              </w:rPr>
-              <w:t>database/migrations/06_update_project_codes.sql</w:t>
-            </w:r>
-          </w:p>
-        </w:tc>
-        <w:tc>
-          <w:tcPr>
-            <w:tcW w:type="dxa" w:w="5328"/>
-            <w:vAlign w:val="center"/>
-            <w:tcMar>
-              <w:top w:w="90" w:type="dxa"/>
-              <w:start w:w="110" w:type="dxa"/>
-              <w:bottom w:w="90" w:type="dxa"/>
-              <w:end w:w="110" w:type="dxa"/>
-            </w:tcMar>
-            <w:shd w:fill="F5F5F5"/>
-          </w:tcPr>
-          <w:p>
-            <w:pPr>
-              <w:spacing w:after="0"/>
-            </w:pPr>
-            <w:r/>
-            <w:r>
-              <w:rPr>
-                <w:b w:val="0"/>
-                <w:sz w:val="17"/>
-              </w:rPr>
-              <w:t>Optional migration for older project records.</w:t>
-            </w:r>
-          </w:p>
-        </w:tc>
-      </w:tr>
-      <w:tr>
-        <w:tc>
-          <w:tcPr>
-            <w:tcW w:type="dxa" w:w="4464"/>
-            <w:vAlign w:val="center"/>
-            <w:tcMar>
-              <w:top w:w="90" w:type="dxa"/>
-              <w:start w:w="110" w:type="dxa"/>
-              <w:bottom w:w="90" w:type="dxa"/>
-              <w:end w:w="110" w:type="dxa"/>
-            </w:tcMar>
-          </w:tcPr>
-          <w:p>
-            <w:pPr>
-              <w:spacing w:after="0"/>
-            </w:pPr>
-            <w:r/>
-            <w:r>
-              <w:rPr>
-                <w:b w:val="0"/>
-                <w:sz w:val="17"/>
-              </w:rPr>
-              <w:t>database/migrations/07_add_catalog_uniqueness.sql</w:t>
-            </w:r>
-          </w:p>
-        </w:tc>
-        <w:tc>
-          <w:tcPr>
-            <w:tcW w:type="dxa" w:w="5328"/>
-            <w:vAlign w:val="center"/>
-            <w:tcMar>
-              <w:top w:w="90" w:type="dxa"/>
-              <w:start w:w="110" w:type="dxa"/>
-              <w:bottom w:w="90" w:type="dxa"/>
-              <w:end w:w="110" w:type="dxa"/>
-            </w:tcMar>
-          </w:tcPr>
-          <w:p>
-            <w:pPr>
-              <w:spacing w:after="0"/>
-            </w:pPr>
-            <w:r/>
-            <w:r>
-              <w:rPr>
-                <w:b w:val="0"/>
-                <w:sz w:val="17"/>
-              </w:rPr>
-              <w:t>Optional catalog uniqueness migration.</w:t>
-            </w:r>
-          </w:p>
-        </w:tc>
-      </w:tr>
-      <w:tr>
-        <w:tc>
-          <w:tcPr>
-            <w:tcW w:type="dxa" w:w="4464"/>
-            <w:vAlign w:val="center"/>
-            <w:tcMar>
-              <w:top w:w="90" w:type="dxa"/>
-              <w:start w:w="110" w:type="dxa"/>
-              <w:bottom w:w="90" w:type="dxa"/>
-              <w:end w:w="110" w:type="dxa"/>
-            </w:tcMar>
-            <w:shd w:fill="F5F5F5"/>
-          </w:tcPr>
-          <w:p>
-            <w:pPr>
-              <w:spacing w:after="0"/>
-            </w:pPr>
-            <w:r/>
-            <w:r>
-              <w:rPr>
-                <w:b w:val="0"/>
-                <w:sz w:val="17"/>
-              </w:rPr>
-              <w:t>database/migrations/08_seed_demo_opportunities.sql</w:t>
-            </w:r>
-          </w:p>
-        </w:tc>
-        <w:tc>
-          <w:tcPr>
-            <w:tcW w:type="dxa" w:w="5328"/>
-            <w:vAlign w:val="center"/>
-            <w:tcMar>
-              <w:top w:w="90" w:type="dxa"/>
-              <w:start w:w="110" w:type="dxa"/>
-              <w:bottom w:w="90" w:type="dxa"/>
-              <w:end w:w="110" w:type="dxa"/>
-            </w:tcMar>
-            <w:shd w:fill="F5F5F5"/>
-          </w:tcPr>
-          <w:p>
-            <w:pPr>
-              <w:spacing w:after="0"/>
-            </w:pPr>
-            <w:r/>
-            <w:r>
-              <w:rPr>
-                <w:b w:val="0"/>
-                <w:sz w:val="17"/>
-              </w:rPr>
-              <w:t>Optional larger demonstration dataset.</w:t>
+              <w:t>Three business questions and matching reports.</w:t>
             </w:r>
           </w:p>
         </w:tc>

</xml_diff>